<commit_message>
Lab 4: add Qian et al. 2010 paper and Supplementary Methods PDFs to the page
Co-Authored-By: Claude Fable 5.1 <noreply@anthropic.com>
Claude-Session: https://claude.ai/code/session_01L5wtdFQ56tSrjgsPVTkoXa
</commit_message>
<xml_diff>
--- a/docs/downloads/DATA405_Lab4_Handout.docx
+++ b/docs/downloads/DATA405_Lab4_Handout.docx
@@ -657,6 +657,34 @@
           <w:sz w:val="21"/>
           <w:szCs w:val="21"/>
         </w:rPr>
+        <w:t xml:space="preserve">The paper: </w:t>
+      </w:r>
+      <w:r>
+        <w:rPr>
+          <w:rFonts w:ascii="Calibri" w:cs="Calibri" w:eastAsia="Calibri" w:hAnsi="Calibri"/>
+          <w:sz w:val="21"/>
+          <w:szCs w:val="21"/>
+        </w:rPr>
+        <w:t xml:space="preserve">Qian et al. 2010 and its Supplementary Methods are on the Lab 4 page (PDFs). Read the first two pages and the paragraph of the Supplementary Methods on how the yeast expression levels were obtained.</w:t>
+      </w:r>
+    </w:p>
+    <w:p>
+      <w:pPr>
+        <w:pStyle w:val="ListParagraph"/>
+        <w:numPr>
+          <w:ilvl w:val="0"/>
+          <w:numId w:val="2"/>
+        </w:numPr>
+        <w:spacing w:after="60"/>
+      </w:pPr>
+      <w:r>
+        <w:rPr>
+          <w:rFonts w:ascii="Calibri" w:cs="Calibri" w:eastAsia="Calibri" w:hAnsi="Calibri"/>
+          <w:b/>
+          <w:bCs/>
+          <w:sz w:val="21"/>
+          <w:szCs w:val="21"/>
+        </w:rPr>
         <w:t xml:space="preserve">Colab: </w:t>
       </w:r>
       <w:r>
@@ -667,7 +695,7 @@
         </w:rPr>
         <w:t xml:space="preserve">open the notebook from the Lab 4 page (</w:t>
       </w:r>
-      <w:hyperlink w:history="1" r:id="rIdzoct-6s_qowirc__68pch">
+      <w:hyperlink w:history="1" r:id="rIdusot8zogokyuybqgkzod0">
         <w:r>
           <w:rPr>
             <w:rFonts w:ascii="Calibri" w:cs="Calibri" w:eastAsia="Calibri" w:hAnsi="Calibri"/>

</xml_diff>